<commit_message>
Reduced use of party label in petition template
</commit_message>
<xml_diff>
--- a/docassemble/PetitionForRuleToShowCauseFamily/data/templates/word_petition_rule_family.docx
+++ b/docassemble/PetitionForRuleToShowCauseFamily/data/templates/word_petition_rule_family.docx
@@ -1153,43 +1153,43 @@
         <w:t xml:space="preserve"> </w:t>
       </w:r>
       <w:r>
-        <w:t>{{capitalize(party_label)}}</w:t>
+        <w:t>Petitioner,</w:t>
+      </w:r>
+      <w:r>
+        <w:t xml:space="preserve"> </w:t>
+      </w:r>
+      <w:r>
+        <w:t>{{users[0].name_full()}}</w:t>
       </w:r>
       <w:r>
         <w:t xml:space="preserve">, </w:t>
       </w:r>
       <w:r>
+        <w:t xml:space="preserve">pursuant to {{statute}}, </w:t>
+      </w:r>
+      <w:r>
+        <w:t xml:space="preserve">and moves this Court to issue a Rule to Show Cause against </w:t>
+      </w:r>
+      <w:r>
+        <w:t>Respondent</w:t>
+      </w:r>
+      <w:r>
+        <w:t>,</w:t>
+      </w:r>
+      <w:r>
+        <w:t xml:space="preserve"> </w:t>
+      </w:r>
+      <w:r>
+        <w:t>{{other_parties[0].name_full</w:t>
+      </w:r>
+      <w:r>
+        <w:t>(</w:t>
+      </w:r>
+      <w:r>
+        <w:t xml:space="preserve">)}}, as to why they should not be held in Indirect Civil Contempt of Court for their refusal to pay child support and/or other child-related expenses pursuant this Court's order. In support of this Petition, </w:t>
+      </w:r>
+      <w:r>
         <w:t>{{users[0].name_full()}}</w:t>
-      </w:r>
-      <w:r>
-        <w:t xml:space="preserve">, </w:t>
-      </w:r>
-      <w:r>
-        <w:t xml:space="preserve">pursuant to {{statute}}, </w:t>
-      </w:r>
-      <w:r>
-        <w:t xml:space="preserve">and moves this Court to issue a Rule to Show Cause against </w:t>
-      </w:r>
-      <w:r>
-        <w:t>{{opponent_label}}</w:t>
-      </w:r>
-      <w:r>
-        <w:t>,</w:t>
-      </w:r>
-      <w:r>
-        <w:t xml:space="preserve"> </w:t>
-      </w:r>
-      <w:r>
-        <w:t>{{other_parties[0].name_full</w:t>
-      </w:r>
-      <w:r>
-        <w:t>(</w:t>
-      </w:r>
-      <w:r>
-        <w:t xml:space="preserve">)}}, as to why they should not be held in Indirect Civil Contempt of Court for their refusal to pay child support and/or other child-related expenses pursuant this Court's order. In support of this Petition, </w:t>
-      </w:r>
-      <w:r>
-        <w:t>{{capitalize(party_label)}}</w:t>
       </w:r>
       <w:r>
         <w:t xml:space="preserve"> states as follows:</w:t>
@@ -1219,7 +1219,21 @@
           <w:sz w:val="24"/>
           <w:szCs w:val="24"/>
         </w:rPr>
-        <w:t xml:space="preserve">Petitioner filed their Petition for </w:t>
+        <w:t>{{users[0].name_full()}}</w:t>
+      </w:r>
+      <w:r>
+        <w:rPr>
+          <w:sz w:val="24"/>
+          <w:szCs w:val="24"/>
+        </w:rPr>
+        <w:t xml:space="preserve"> </w:t>
+      </w:r>
+      <w:r>
+        <w:rPr>
+          <w:sz w:val="24"/>
+          <w:szCs w:val="24"/>
+        </w:rPr>
+        <w:t xml:space="preserve">filed their Petition for </w:t>
       </w:r>
       <w:r>
         <w:rPr>
@@ -1396,7 +1410,15 @@
           <w:sz w:val="24"/>
           <w:szCs w:val="24"/>
         </w:rPr>
-        <w:t xml:space="preserve"> children were{% else %} </w:t>
+        <w:t xml:space="preserve"> children were{% </w:t>
+      </w:r>
+      <w:r>
+        <w:rPr>
+          <w:sz w:val="24"/>
+          <w:szCs w:val="24"/>
+        </w:rPr>
+        <w:lastRenderedPageBreak/>
+        <w:t xml:space="preserve">else %} </w:t>
       </w:r>
       <w:r>
         <w:rPr>
@@ -1432,16 +1454,7 @@
           <w:sz w:val="24"/>
           <w:szCs w:val="24"/>
         </w:rPr>
-        <w:t xml:space="preserve">{% for child in </w:t>
-      </w:r>
-      <w:r>
-        <w:rPr>
-          <w:rFonts w:eastAsia="Segoe UI Emoji"/>
-          <w:sz w:val="24"/>
-          <w:szCs w:val="24"/>
-        </w:rPr>
-        <w:lastRenderedPageBreak/>
-        <w:t>children %}</w:t>
+        <w:t>{% for child in children %}</w:t>
       </w:r>
     </w:p>
     <w:p>
@@ -2002,7 +2015,21 @@
           <w:sz w:val="24"/>
           <w:szCs w:val="24"/>
         </w:rPr>
-        <w:t xml:space="preserve">Petitioner has attempted to remedy the situation, without success, by requesting payment from </w:t>
+        <w:t>{{users[0].name_full()}}</w:t>
+      </w:r>
+      <w:r>
+        <w:rPr>
+          <w:sz w:val="24"/>
+          <w:szCs w:val="24"/>
+        </w:rPr>
+        <w:t xml:space="preserve"> </w:t>
+      </w:r>
+      <w:r>
+        <w:rPr>
+          <w:sz w:val="24"/>
+          <w:szCs w:val="24"/>
+        </w:rPr>
+        <w:t xml:space="preserve">has attempted to remedy the situation, without success, by requesting payment from </w:t>
       </w:r>
       <w:r>
         <w:rPr>
@@ -2124,6 +2151,7 @@
           <w:sz w:val="24"/>
           <w:szCs w:val="24"/>
         </w:rPr>
+        <w:lastRenderedPageBreak/>
         <w:t>Section 505 of the IMDMA requires interest on overdue child support.</w:t>
       </w:r>
     </w:p>
@@ -2483,7 +2511,28 @@
           <w:sz w:val="24"/>
           <w:szCs w:val="24"/>
         </w:rPr>
-        <w:t>That Petitioner have such other relief as may be just and equitable.</w:t>
+        <w:t xml:space="preserve">That </w:t>
+      </w:r>
+      <w:r>
+        <w:rPr>
+          <w:sz w:val="24"/>
+          <w:szCs w:val="24"/>
+        </w:rPr>
+        <w:t>{{users[0].name_full()}}</w:t>
+      </w:r>
+      <w:r>
+        <w:rPr>
+          <w:sz w:val="24"/>
+          <w:szCs w:val="24"/>
+        </w:rPr>
+        <w:t xml:space="preserve"> </w:t>
+      </w:r>
+      <w:r>
+        <w:rPr>
+          <w:sz w:val="24"/>
+          <w:szCs w:val="24"/>
+        </w:rPr>
+        <w:t>have such other relief as may be just and equitable.</w:t>
       </w:r>
     </w:p>
     <w:p>
@@ -2568,10 +2617,13 @@
         <w:t xml:space="preserve">)}}, as to why they should not be held in Indirect Civil Contempt of Court for their refusal to pay maintenance and/or other maintenance-related expenses pursuant this Court's order. In support of this Petition, </w:t>
       </w:r>
       <w:r>
-        <w:t>{{capitalize(party_label)}}</w:t>
-      </w:r>
-      <w:r>
-        <w:t xml:space="preserve"> states as follows:</w:t>
+        <w:t>{{users[0].name_full()}}</w:t>
+      </w:r>
+      <w:r>
+        <w:t xml:space="preserve"> </w:t>
+      </w:r>
+      <w:r>
+        <w:t>states as follows:</w:t>
       </w:r>
     </w:p>
     <w:p>
@@ -2598,7 +2650,21 @@
           <w:sz w:val="24"/>
           <w:szCs w:val="24"/>
         </w:rPr>
-        <w:t xml:space="preserve">Petitioner filed their Petition for </w:t>
+        <w:t>{{users[0].name_full()}}</w:t>
+      </w:r>
+      <w:r>
+        <w:rPr>
+          <w:sz w:val="24"/>
+          <w:szCs w:val="24"/>
+        </w:rPr>
+        <w:t xml:space="preserve"> </w:t>
+      </w:r>
+      <w:r>
+        <w:rPr>
+          <w:sz w:val="24"/>
+          <w:szCs w:val="24"/>
+        </w:rPr>
+        <w:t xml:space="preserve">filed their Petition for </w:t>
       </w:r>
       <w:r>
         <w:rPr>
@@ -2691,6 +2757,7 @@
           <w:sz w:val="24"/>
           <w:szCs w:val="24"/>
         </w:rPr>
+        <w:lastRenderedPageBreak/>
         <w:t>maintenance</w:t>
       </w:r>
       <w:r>
@@ -2782,15 +2849,7 @@
           <w:sz w:val="24"/>
           <w:szCs w:val="24"/>
         </w:rPr>
-        <w:t xml:space="preserve">, attached as </w:t>
-      </w:r>
-      <w:r>
-        <w:rPr>
-          <w:sz w:val="24"/>
-          <w:szCs w:val="24"/>
-        </w:rPr>
-        <w:lastRenderedPageBreak/>
-        <w:t>Exhibit A.</w:t>
+        <w:t>, attached as Exhibit A.</w:t>
       </w:r>
     </w:p>
     <w:p>
@@ -3255,7 +3314,21 @@
           <w:sz w:val="24"/>
           <w:szCs w:val="24"/>
         </w:rPr>
-        <w:t xml:space="preserve">Petitioner has attempted to remedy the situation, without success, by requesting payment from </w:t>
+        <w:t>{{users[0].name_full()}}</w:t>
+      </w:r>
+      <w:r>
+        <w:rPr>
+          <w:sz w:val="24"/>
+          <w:szCs w:val="24"/>
+        </w:rPr>
+        <w:t xml:space="preserve"> </w:t>
+      </w:r>
+      <w:r>
+        <w:rPr>
+          <w:sz w:val="24"/>
+          <w:szCs w:val="24"/>
+        </w:rPr>
+        <w:t xml:space="preserve">has attempted to remedy the situation, without success, by requesting payment from </w:t>
       </w:r>
       <w:r>
         <w:rPr>
@@ -3269,14 +3342,7 @@
           <w:sz w:val="24"/>
           <w:szCs w:val="24"/>
         </w:rPr>
-        <w:t>.</w:t>
-      </w:r>
-      <w:r>
-        <w:rPr>
-          <w:sz w:val="24"/>
-          <w:szCs w:val="24"/>
-        </w:rPr>
-        <w:t>{% endif %}</w:t>
+        <w:t>.{% endif %}</w:t>
       </w:r>
     </w:p>
     <w:p>
@@ -3538,15 +3604,7 @@
           <w:sz w:val="24"/>
           <w:szCs w:val="24"/>
         </w:rPr>
-        <w:t xml:space="preserve"> Rule to Issue against {{other_parties[0].name_full()}} to show cause, if they </w:t>
-      </w:r>
-      <w:r>
-        <w:rPr>
-          <w:sz w:val="24"/>
-          <w:szCs w:val="24"/>
-        </w:rPr>
-        <w:lastRenderedPageBreak/>
-        <w:t>have any, why they should not be held in contempt of this Court’s order of {{maintenance_order_date}}.</w:t>
+        <w:t xml:space="preserve"> Rule to Issue against {{other_parties[0].name_full()}} to show cause, if they have any, why they should not be held in contempt of this Court’s order of {{maintenance_order_date}}.</w:t>
       </w:r>
     </w:p>
     <w:p>
@@ -3794,7 +3852,28 @@
           <w:sz w:val="24"/>
           <w:szCs w:val="24"/>
         </w:rPr>
-        <w:t>That Petitioner have such other relief as may be just and equitable.</w:t>
+        <w:t xml:space="preserve">That </w:t>
+      </w:r>
+      <w:r>
+        <w:rPr>
+          <w:sz w:val="24"/>
+          <w:szCs w:val="24"/>
+        </w:rPr>
+        <w:t>{{users[0].name_full()}}</w:t>
+      </w:r>
+      <w:r>
+        <w:rPr>
+          <w:sz w:val="24"/>
+          <w:szCs w:val="24"/>
+        </w:rPr>
+        <w:t xml:space="preserve"> </w:t>
+      </w:r>
+      <w:r>
+        <w:rPr>
+          <w:sz w:val="24"/>
+          <w:szCs w:val="24"/>
+        </w:rPr>
+        <w:t>have such other relief as may be just and equitable.</w:t>
       </w:r>
     </w:p>
     <w:p>
@@ -3893,7 +3972,7 @@
         <w:t xml:space="preserve">. In support of this Petition, </w:t>
       </w:r>
       <w:r>
-        <w:t>{{capitalize(party_label)}}</w:t>
+        <w:t>{{users[0].name_full()}}</w:t>
       </w:r>
       <w:r>
         <w:t xml:space="preserve"> states as follows:</w:t>
@@ -4142,7 +4221,15 @@
           <w:sz w:val="24"/>
           <w:szCs w:val="24"/>
         </w:rPr>
-        <w:t>.replace(para.requirement[0],para.requirement[0].lower(),1)</w:t>
+        <w:t>.replace(para.requirement[0],par</w:t>
+      </w:r>
+      <w:r>
+        <w:rPr>
+          <w:sz w:val="24"/>
+          <w:szCs w:val="24"/>
+        </w:rPr>
+        <w:lastRenderedPageBreak/>
+        <w:t>a.requirement[0].lower(),1)</w:t>
       </w:r>
       <w:r>
         <w:rPr>
@@ -4225,7 +4312,6 @@
           <w:sz w:val="24"/>
           <w:szCs w:val="24"/>
         </w:rPr>
-        <w:lastRenderedPageBreak/>
         <w:t>{{</w:t>
       </w:r>
       <w:r>
@@ -4309,14 +4395,21 @@
           <w:sz w:val="24"/>
           <w:szCs w:val="24"/>
         </w:rPr>
-        <w:t>Petitioner has attempted to remedy the situation, without success</w:t>
-      </w:r>
-      <w:r>
-        <w:rPr>
-          <w:sz w:val="24"/>
-          <w:szCs w:val="24"/>
-        </w:rPr>
-        <w:t xml:space="preserve">, by asking </w:t>
+        <w:t>{{users[0].name_full()}}</w:t>
+      </w:r>
+      <w:r>
+        <w:rPr>
+          <w:sz w:val="24"/>
+          <w:szCs w:val="24"/>
+        </w:rPr>
+        <w:t xml:space="preserve"> </w:t>
+      </w:r>
+      <w:r>
+        <w:rPr>
+          <w:sz w:val="24"/>
+          <w:szCs w:val="24"/>
+        </w:rPr>
+        <w:t xml:space="preserve">has attempted to remedy the situation, without success, by asking </w:t>
       </w:r>
       <w:r>
         <w:rPr>
@@ -4699,18 +4792,17 @@
         <w:t xml:space="preserve">That </w:t>
       </w:r>
       <w:r>
-        <w:rPr>
-          <w:sz w:val="24"/>
-          <w:szCs w:val="24"/>
-        </w:rPr>
-        <w:t>{{capitalize(party_label)}}</w:t>
-      </w:r>
-      <w:r>
-        <w:rPr>
-          <w:sz w:val="24"/>
-          <w:szCs w:val="24"/>
-        </w:rPr>
-        <w:t xml:space="preserve"> have such other relief as may be just and equitable.</w:t>
+        <w:t>{{users[0].name_full()}}</w:t>
+      </w:r>
+      <w:r>
+        <w:t xml:space="preserve"> </w:t>
+      </w:r>
+      <w:r>
+        <w:rPr>
+          <w:sz w:val="24"/>
+          <w:szCs w:val="24"/>
+        </w:rPr>
+        <w:t>have such other relief as may be just and equitable.</w:t>
       </w:r>
     </w:p>
     <w:p>

</xml_diff>